<commit_message>
docs(mop): MOP docx régénérés + REX pandoc/wizy/MCP + plans + runbooks
OPSSD M0.20-24 régénérés ; REX docx/wizy/MCP-stack ; plan upgrade sese ; runbook docs à mirrorer ; sop-alignment + incidents v2.

Co-Authored-By: Claude Opus 4.8 <noreply@anthropic.com>
</commit_message>
<xml_diff>
--- a/docs/mop/OPSSD-03.03.M0.20-P.docx
+++ b/docs/mop/OPSSD-03.03.M0.20-P.docx
@@ -2,6 +2,46 @@
 <file path=word/document.xml><?xml version="1.0" encoding="utf-8"?>
 <w:document xmlns:wpc="http://schemas.microsoft.com/office/word/2010/wordprocessingCanvas" xmlns:mo="http://schemas.microsoft.com/office/mac/office/2008/main" xmlns:mc="http://schemas.openxmlformats.org/markup-compatibility/2006" xmlns:mv="urn:schemas-microsoft-com:mac:vml" xmlns:o="urn:schemas-microsoft-com:office:office" xmlns:r="http://schemas.openxmlformats.org/officeDocument/2006/relationships" xmlns:m="http://schemas.openxmlformats.org/officeDocument/2006/math" xmlns:v="urn:schemas-microsoft-com:vml" xmlns:wp14="http://schemas.microsoft.com/office/word/2010/wordprocessingDrawing" xmlns:wp="http://schemas.openxmlformats.org/drawingml/2006/wordprocessingDrawing" xmlns:w10="urn:schemas-microsoft-com:office:word" xmlns:w="http://schemas.openxmlformats.org/wordprocessingml/2006/main" xmlns:w14="http://schemas.microsoft.com/office/word/2010/wordml" xmlns:wpg="http://schemas.microsoft.com/office/word/2010/wordprocessingGroup" xmlns:wpi="http://schemas.microsoft.com/office/word/2010/wordprocessingInk" xmlns:wne="http://schemas.microsoft.com/office/word/2006/wordml" xmlns:wps="http://schemas.microsoft.com/office/word/2010/wordprocessingShape" mc:Ignorable="w14 wp14">
   <w:body>
+    <w:p>
+      <w:pPr>
+        <w:jc w:val="center"/>
+      </w:pPr>
+      <w:r>
+        <w:drawing>
+          <wp:inline xmlns:a="http://schemas.openxmlformats.org/drawingml/2006/main" xmlns:pic="http://schemas.openxmlformats.org/drawingml/2006/picture">
+            <wp:extent cx="1800000" cy="227427"/>
+            <wp:docPr id="1" name="Picture 1"/>
+            <wp:cNvGraphicFramePr>
+              <a:graphicFrameLocks noChangeAspect="1"/>
+            </wp:cNvGraphicFramePr>
+            <a:graphic>
+              <a:graphicData uri="http://schemas.openxmlformats.org/drawingml/2006/picture">
+                <pic:pic>
+                  <pic:nvPicPr>
+                    <pic:cNvPr id="0" name="mop-logo.jpg"/>
+                    <pic:cNvPicPr/>
+                  </pic:nvPicPr>
+                  <pic:blipFill>
+                    <a:blip r:embed="rId9"/>
+                    <a:stretch>
+                      <a:fillRect/>
+                    </a:stretch>
+                  </pic:blipFill>
+                  <pic:spPr>
+                    <a:xfrm>
+                      <a:off x="0" y="0"/>
+                      <a:ext cx="1800000" cy="227427"/>
+                    </a:xfrm>
+                    <a:prstGeom prst="rect"/>
+                  </pic:spPr>
+                </pic:pic>
+              </a:graphicData>
+            </a:graphic>
+          </wp:inline>
+        </w:drawing>
+      </w:r>
+    </w:p>
+    <w:p/>
     <w:p>
       <w:pPr>
         <w:jc w:val="center"/>
@@ -21,12 +61,33 @@
       </w:pPr>
       <w:r>
         <w:rPr>
-          <w:sz w:val="22"/>
+          <w:sz w:val="20"/>
+        </w:rPr>
+        <w:t>Procédure = MOP</w:t>
+      </w:r>
+    </w:p>
+    <w:p>
+      <w:pPr>
+        <w:jc w:val="center"/>
+      </w:pPr>
+      <w:r>
+        <w:rPr>
+          <w:sz w:val="20"/>
         </w:rPr>
         <w:t>OPSSD-03.03.M0.20-P</w:t>
       </w:r>
     </w:p>
     <w:p/>
+    <w:p>
+      <w:r>
+        <w:rPr>
+          <w:b/>
+          <w:color w:val="1F3864"/>
+          <w:sz w:val="18"/>
+        </w:rPr>
+        <w:t>Carte d'identité du document</w:t>
+      </w:r>
+    </w:p>
     <w:tbl>
       <w:tblPr>
         <w:tblStyle w:val="TableGrid"/>
@@ -39,28 +100,6 @@
         <w:gridCol w:w="4677"/>
         <w:gridCol w:w="4677"/>
       </w:tblGrid>
-      <w:tr>
-        <w:tc>
-          <w:tcPr>
-            <w:tcW w:type="dxa" w:w="9354"/>
-            <w:gridSpan w:val="2"/>
-            <w:shd w:val="clear" w:color="auto" w:fill="1F3864"/>
-          </w:tcPr>
-          <w:p>
-            <w:pPr>
-              <w:jc w:val="center"/>
-            </w:pPr>
-            <w:r>
-              <w:rPr>
-                <w:b/>
-                <w:color w:val="FFFFFF"/>
-                <w:sz w:val="24"/>
-              </w:rPr>
-              <w:t>MÉTHODE D'OPÉRATION ET DE PROCÉDURE</w:t>
-            </w:r>
-          </w:p>
-        </w:tc>
-      </w:tr>
       <w:tr>
         <w:tc>
           <w:tcPr>
@@ -107,7 +146,73 @@
                 <w:b/>
                 <w:sz w:val="18"/>
               </w:rPr>
-              <w:t>Titre</w:t>
+              <w:t>Type de document</w:t>
+            </w:r>
+          </w:p>
+        </w:tc>
+        <w:tc>
+          <w:tcPr>
+            <w:tcW w:type="dxa" w:w="6520"/>
+          </w:tcPr>
+          <w:p>
+            <w:r/>
+            <w:r>
+              <w:rPr>
+                <w:b w:val="0"/>
+                <w:sz w:val="18"/>
+              </w:rPr>
+              <w:t>MOP</w:t>
+            </w:r>
+          </w:p>
+        </w:tc>
+      </w:tr>
+      <w:tr>
+        <w:tc>
+          <w:tcPr>
+            <w:tcW w:type="dxa" w:w="2835"/>
+            <w:shd w:val="clear" w:color="auto" w:fill="BDD7EE"/>
+          </w:tcPr>
+          <w:p>
+            <w:r/>
+            <w:r>
+              <w:rPr>
+                <w:b/>
+                <w:sz w:val="18"/>
+              </w:rPr>
+              <w:t>Niveau de confidentialité</w:t>
+            </w:r>
+          </w:p>
+        </w:tc>
+        <w:tc>
+          <w:tcPr>
+            <w:tcW w:type="dxa" w:w="6520"/>
+          </w:tcPr>
+          <w:p>
+            <w:r/>
+            <w:r>
+              <w:rPr>
+                <w:b w:val="0"/>
+                <w:sz w:val="18"/>
+              </w:rPr>
+              <w:t>Interne</w:t>
+            </w:r>
+          </w:p>
+        </w:tc>
+      </w:tr>
+      <w:tr>
+        <w:tc>
+          <w:tcPr>
+            <w:tcW w:type="dxa" w:w="2835"/>
+            <w:shd w:val="clear" w:color="auto" w:fill="BDD7EE"/>
+          </w:tcPr>
+          <w:p>
+            <w:r/>
+            <w:r>
+              <w:rPr>
+                <w:b/>
+                <w:sz w:val="18"/>
+              </w:rPr>
+              <w:t>Titre du document</w:t>
             </w:r>
           </w:p>
         </w:tc>
@@ -140,7 +245,7 @@
                 <w:b/>
                 <w:sz w:val="18"/>
               </w:rPr>
-              <w:t>Type</w:t>
+              <w:t>Résumé</w:t>
             </w:r>
           </w:p>
         </w:tc>
@@ -155,7 +260,7 @@
                 <w:b w:val="0"/>
                 <w:sz w:val="18"/>
               </w:rPr>
-              <w:t>MOP</w:t>
+              <w:t>Procédure d'interventionsuite à la perte  de supervision (Lightsoft/Vizee) affectant la visibilité des équipements OTN.</w:t>
             </w:r>
           </w:p>
         </w:tc>
@@ -173,7 +278,7 @@
                 <w:b/>
                 <w:sz w:val="18"/>
               </w:rPr>
-              <w:t>Confidentialité</w:t>
+              <w:t>Champ d'application</w:t>
             </w:r>
           </w:p>
         </w:tc>
@@ -188,7 +293,40 @@
                 <w:b w:val="0"/>
                 <w:sz w:val="18"/>
               </w:rPr>
-              <w:t>Interne</w:t>
+              <w:t>Réseau OTN — NOC Javisi</w:t>
+            </w:r>
+          </w:p>
+        </w:tc>
+      </w:tr>
+      <w:tr>
+        <w:tc>
+          <w:tcPr>
+            <w:tcW w:type="dxa" w:w="2835"/>
+            <w:shd w:val="clear" w:color="auto" w:fill="BDD7EE"/>
+          </w:tcPr>
+          <w:p>
+            <w:r/>
+            <w:r>
+              <w:rPr>
+                <w:b/>
+                <w:sz w:val="18"/>
+              </w:rPr>
+              <w:t>Documents associés</w:t>
+            </w:r>
+          </w:p>
+        </w:tc>
+        <w:tc>
+          <w:tcPr>
+            <w:tcW w:type="dxa" w:w="6520"/>
+          </w:tcPr>
+          <w:p>
+            <w:r/>
+            <w:r>
+              <w:rPr>
+                <w:b w:val="0"/>
+                <w:sz w:val="18"/>
+              </w:rPr>
+              <w:t>Aucun document associé identifié à ce jour.</w:t>
             </w:r>
           </w:p>
         </w:tc>
@@ -254,7 +392,7 @@
                 <w:b w:val="0"/>
                 <w:sz w:val="18"/>
               </w:rPr>
-              <w:t>Brigitte GOMES</w:t>
+              <w:t>Brigitte Gomes</w:t>
             </w:r>
           </w:p>
         </w:tc>
@@ -292,10 +430,23 @@
           </w:p>
         </w:tc>
       </w:tr>
+    </w:tbl>
+    <w:p/>
+    <w:tbl>
+      <w:tblPr>
+        <w:tblStyle w:val="TableGrid"/>
+        <w:tblW w:type="auto" w:w="0"/>
+        <w:tblLayout w:type="fixed"/>
+        <w:tblLook w:firstColumn="1" w:firstRow="1" w:lastColumn="0" w:lastRow="0" w:noHBand="0" w:noVBand="1" w:val="04A0"/>
+      </w:tblPr>
+      <w:tblGrid>
+        <w:gridCol w:w="4677"/>
+        <w:gridCol w:w="4677"/>
+      </w:tblGrid>
       <w:tr>
         <w:tc>
           <w:tcPr>
-            <w:tcW w:type="dxa" w:w="2835"/>
+            <w:tcW w:type="dxa" w:w="4677"/>
             <w:shd w:val="clear" w:color="auto" w:fill="BDD7EE"/>
           </w:tcPr>
           <w:p>
@@ -305,13 +456,31 @@
                 <w:b/>
                 <w:sz w:val="18"/>
               </w:rPr>
-              <w:t>Date d'entrée en vigueur</w:t>
+              <w:t>Entrée en vigueur</w:t>
             </w:r>
           </w:p>
         </w:tc>
         <w:tc>
           <w:tcPr>
-            <w:tcW w:type="dxa" w:w="6520"/>
+            <w:tcW w:type="dxa" w:w="4677"/>
+            <w:shd w:val="clear" w:color="auto" w:fill="BDD7EE"/>
+          </w:tcPr>
+          <w:p>
+            <w:r/>
+            <w:r>
+              <w:rPr>
+                <w:b/>
+                <w:sz w:val="18"/>
+              </w:rPr>
+              <w:t>Révision</w:t>
+            </w:r>
+          </w:p>
+        </w:tc>
+      </w:tr>
+      <w:tr>
+        <w:tc>
+          <w:tcPr>
+            <w:tcW w:type="dxa" w:w="4677"/>
           </w:tcPr>
           <w:p>
             <w:r/>
@@ -324,27 +493,9 @@
             </w:r>
           </w:p>
         </w:tc>
-      </w:tr>
-      <w:tr>
         <w:tc>
           <w:tcPr>
-            <w:tcW w:type="dxa" w:w="2835"/>
-            <w:shd w:val="clear" w:color="auto" w:fill="BDD7EE"/>
-          </w:tcPr>
-          <w:p>
-            <w:r/>
-            <w:r>
-              <w:rPr>
-                <w:b/>
-                <w:sz w:val="18"/>
-              </w:rPr>
-              <w:t>Date de révision planifiée</w:t>
-            </w:r>
-          </w:p>
-        </w:tc>
-        <w:tc>
-          <w:tcPr>
-            <w:tcW w:type="dxa" w:w="6520"/>
+            <w:tcW w:type="dxa" w:w="4677"/>
           </w:tcPr>
           <w:p>
             <w:r/>
@@ -566,23 +717,7 @@
         <w:rPr>
           <w:sz w:val="20"/>
         </w:rPr>
-        <w:t>Ce document définit la procédure d'intervention du NOC Service Technique en réponse à une perte partielle ou totale de supervision des équipements OTN Ribbon/Apollo déployés sur les sites Telehouse 2 (TH2) et Telehouse 3 (TH3).</w:t>
-      </w:r>
-    </w:p>
-    <w:p>
-      <w:r>
-        <w:rPr>
-          <w:sz w:val="20"/>
-        </w:rPr>
-        <w:t>La supervision repose sur deux systèmes complémentaires : Lightsoft (EMS Ribbon, canal GCC/STMS interne) et Vizee (SaaS OOB). Une perte de supervision peut affecter la visibilité des NE sans nécessairement impliquer une interruption de service client — la distinction est critique pour la qualification initiale.</w:t>
-      </w:r>
-    </w:p>
-    <w:p>
-      <w:r>
-        <w:rPr>
-          <w:sz w:val="20"/>
-        </w:rPr>
-        <w:t>Sur la base de 14 incidents (2021-2025) : causes principales — perte lien OOB opérateur Cogent/euNetworks (~60%), bascule cluster Fortigate (~25%), alarmes OSPF auto-cleared sur PHO/Ribbon (~15%). TTR moyen : 15–45 min.</w:t>
+        <w:t>Procédure d'interventionsuite à la perte  de supervision (Lightsoft/Vizee) affectant la visibilité des équipements OTN.</w:t>
       </w:r>
     </w:p>
     <w:p/>
@@ -603,7 +738,7 @@
         <w:rPr>
           <w:sz w:val="18"/>
         </w:rPr>
-        <w:t>Lightsoft (EMS Ribbon) : Poste OOB Telehouse 2 &amp; 3</w:t>
+        <w:t>Lighsoft : Poste OOB</w:t>
       </w:r>
     </w:p>
     <w:p>
@@ -611,7 +746,7 @@
         <w:rPr>
           <w:sz w:val="18"/>
         </w:rPr>
-        <w:t>Vizee : dash-4uvocd.vizee.io — supervision SaaS et centralisation logs OOB</w:t>
+        <w:t>Vizee : dash-4uvocd.vizee.io</w:t>
       </w:r>
     </w:p>
     <w:p>
@@ -619,7 +754,7 @@
         <w:rPr>
           <w:sz w:val="18"/>
         </w:rPr>
-        <w:t>Firewall : cluster Fortigate 100F (TH2-FW-01, TH3-FW-01) — protection périmètre OOB</w:t>
+        <w:t>Firewall : cluster Fortigate 100F (TH2-FW-01, TH3-FW-01)</w:t>
       </w:r>
     </w:p>
     <w:p>
@@ -627,7 +762,7 @@
         <w:rPr>
           <w:sz w:val="18"/>
         </w:rPr>
-        <w:t>Switchs OOB : Cisco Catalyst C9200L-48T-4X (TH2-SW-01/02, TH3-SW-01/02)</w:t>
+        <w:t>Switchs OOB : Cisco C9200L-48T-4X (TH2-SW-01/02, TH3-SW-01/02)</w:t>
       </w:r>
     </w:p>
     <w:p>
@@ -635,7 +770,7 @@
         <w:rPr>
           <w:sz w:val="18"/>
         </w:rPr>
-        <w:t>Serveur Console : Opengear CM7000 (TH2-CON-01, TH3-CON-01) — accès console hors-bande</w:t>
+        <w:t>Serveur Console : Opengear CM7000 (TH2-CON-01, TH3-CON-01)</w:t>
       </w:r>
     </w:p>
     <w:p>
@@ -643,7 +778,7 @@
         <w:rPr>
           <w:sz w:val="18"/>
         </w:rPr>
-        <w:t>Serveur Radius : Radiator Mini Pack — authentification Lightsoft / Vizee</w:t>
+        <w:t>Serveur Radius : Radiator Mini Pack</w:t>
       </w:r>
     </w:p>
     <w:p/>
@@ -664,7 +799,7 @@
         <w:rPr>
           <w:sz w:val="18"/>
         </w:rPr>
-        <w:t>Support Supervision OOB : lugos.atlassian.net (login otn.noc) — ticket priorité P2</w:t>
+        <w:t>Support Supervision OOB : lugos.atlassian.net (login otn.noc)</w:t>
       </w:r>
     </w:p>
     <w:p>
@@ -672,7 +807,7 @@
         <w:rPr>
           <w:sz w:val="18"/>
         </w:rPr>
-        <w:t>Telehouse NOC : OTN.Management@fr.telehouse.net — escalade N+1 site</w:t>
+        <w:t>Telehouse : OTN.Management@fr.telehouse.net</w:t>
       </w:r>
     </w:p>
     <w:p>
@@ -680,15 +815,7 @@
         <w:rPr>
           <w:sz w:val="18"/>
         </w:rPr>
-        <w:t>Escalade Telehouse N+1 : si TTR &gt; 60 min ou impact service client confirmé</w:t>
-      </w:r>
-    </w:p>
-    <w:p>
-      <w:r>
-        <w:rPr>
-          <w:sz w:val="18"/>
-        </w:rPr>
-        <w:t>Astreinte Lugos : disponible 24h/7j pour réinitialisation Radius et switch OOB</w:t>
+        <w:t>Escalade Telehouse N+1</w:t>
       </w:r>
     </w:p>
     <w:p/>
@@ -940,138 +1067,7 @@
         <w:rPr>
           <w:sz w:val="20"/>
         </w:rPr>
-        <w:t>Objet : standardiser les actions NOC pour diagnostiquer et résoudre toute perte de visibilité sur les équipements OTN Ribbon/Apollo, quelle que soit la couche affectée (réseau OOB, authentification Radius, supervision EMS).</w:t>
-      </w:r>
-    </w:p>
-    <w:p>
-      <w:r>
-        <w:rPr>
-          <w:sz w:val="20"/>
-        </w:rPr>
-        <w:t>Déclencheurs couverts :</w:t>
-      </w:r>
-    </w:p>
-    <w:p>
-      <w:pPr>
-        <w:pStyle w:val="ListBullet"/>
-      </w:pPr>
-      <w:r>
-        <w:rPr>
-          <w:sz w:val="20"/>
-        </w:rPr>
-        <w:t>Alerte Vizee : Restart ou bascule du firewall Fortigate (THx-FW-0x)</w:t>
-      </w:r>
-    </w:p>
-    <w:p>
-      <w:pPr>
-        <w:pStyle w:val="ListBullet"/>
-      </w:pPr>
-      <w:r>
-        <w:rPr>
-          <w:sz w:val="20"/>
-        </w:rPr>
-        <w:t>Alarme opérateur OOB : perte de lien Cogent ou euNetworks sur port WAN</w:t>
-      </w:r>
-    </w:p>
-    <w:p>
-      <w:pPr>
-        <w:pStyle w:val="ListBullet"/>
-      </w:pPr>
-      <w:r>
-        <w:rPr>
-          <w:sz w:val="20"/>
-        </w:rPr>
-        <w:t>Alarme 'No OSPF hello packets received from neighbor' sur NE Ribbon (typiquement auto-cleared &lt; 30 s ; à corréler avec alarmes PHO)</w:t>
-      </w:r>
-    </w:p>
-    <w:p>
-      <w:pPr>
-        <w:pStyle w:val="ListBullet"/>
-      </w:pPr>
-      <w:r>
-        <w:rPr>
-          <w:sz w:val="20"/>
-        </w:rPr>
-        <w:t>Perte d'accès CLI SSH sur un ou plusieurs NE via réseau OOB</w:t>
-      </w:r>
-    </w:p>
-    <w:p>
-      <w:pPr>
-        <w:pStyle w:val="ListBullet"/>
-      </w:pPr>
-      <w:r>
-        <w:rPr>
-          <w:sz w:val="20"/>
-        </w:rPr>
-        <w:t>Blocage d'authentification Lightsoft ou Vizee (Radius)</w:t>
-      </w:r>
-    </w:p>
-    <w:p>
-      <w:pPr>
-        <w:pStyle w:val="ListBullet"/>
-      </w:pPr>
-      <w:r>
-        <w:rPr>
-          <w:sz w:val="20"/>
-        </w:rPr>
-        <w:t>NE en état 'Management Lost' sur Lightsoft (perte GCC/STMS)</w:t>
-      </w:r>
-    </w:p>
-    <w:p>
-      <w:r>
-        <w:rPr>
-          <w:sz w:val="20"/>
-        </w:rPr>
-        <w:t>Exclusions : dégradation optique FEC/BER → MOP M0.21 ; perte service client LOS/LOF → MOP M0.22-M0.24. Reconfiguration réseau OOB : périmètre Lugos NOC exclusivement.</w:t>
-      </w:r>
-    </w:p>
-    <w:p>
-      <w:r>
-        <w:rPr>
-          <w:sz w:val="20"/>
-        </w:rPr>
-        <w:t>Criticités :</w:t>
-      </w:r>
-    </w:p>
-    <w:p>
-      <w:pPr>
-        <w:pStyle w:val="ListBullet"/>
-      </w:pPr>
-      <w:r>
-        <w:rPr>
-          <w:sz w:val="20"/>
-        </w:rPr>
-        <w:t>MINEUR : supervision partielle, service client intact, alarme Vizee isolée</w:t>
-      </w:r>
-    </w:p>
-    <w:p>
-      <w:pPr>
-        <w:pStyle w:val="ListBullet"/>
-      </w:pPr>
-      <w:r>
-        <w:rPr>
-          <w:sz w:val="20"/>
-        </w:rPr>
-        <w:t>MINEUR→MAJEUR : supervision multi-sites ou persistante &gt; 30 min, SSH indisponible sur NE, bascule Fortigate confirmée</w:t>
-      </w:r>
-    </w:p>
-    <w:p>
-      <w:pPr>
-        <w:pStyle w:val="ListBullet"/>
-      </w:pPr>
-      <w:r>
-        <w:rPr>
-          <w:sz w:val="20"/>
-        </w:rPr>
-        <w:t>MAJEUR : perte totale Lightsoft + Vizee simultanée, OOB indisponible sur TH2 et TH3</w:t>
-      </w:r>
-    </w:p>
-    <w:p>
-      <w:r>
-        <w:rPr>
-          <w:sz w:val="20"/>
-        </w:rPr>
-        <w:t>Références normatives : ITU-T G.8080 (architecture OTN), ITU-T G.826 (disponibilité), SOP 10-SOP (Vérification OOB &amp; Accès management).</w:t>
+        <w:t>Symptômes couverts : Alerte Vizee: Restart/bascule du firewall (THx-FW-0x) ; Alarme operateur OOB (Cogent euNetworks); Alarme 'No OSPF hello packets received from neighbor' auto-cleared en &lt;30s;</w:t>
       </w:r>
     </w:p>
     <w:p/>
@@ -1091,7 +1087,7 @@
         <w:rPr>
           <w:sz w:val="20"/>
         </w:rPr>
-        <w:t>Responsabilité principale : Service Desk NOC — qualification initiale et application de la procédure de la Phase 1 à la Phase 4.</w:t>
+        <w:t>Responsable : Service Desk</w:t>
       </w:r>
     </w:p>
     <w:p>
@@ -1099,62 +1095,7 @@
         <w:rPr>
           <w:sz w:val="20"/>
         </w:rPr>
-        <w:t>Matrice RACI :</w:t>
-      </w:r>
-    </w:p>
-    <w:p>
-      <w:pPr>
-        <w:pStyle w:val="ListBullet"/>
-      </w:pPr>
-      <w:r>
-        <w:rPr>
-          <w:sz w:val="20"/>
-        </w:rPr>
-        <w:t>Service Desk (NOC) : Responsable (R) — exécution phases 1-4, documentation ticket</w:t>
-      </w:r>
-    </w:p>
-    <w:p>
-      <w:pPr>
-        <w:pStyle w:val="ListBullet"/>
-      </w:pPr>
-      <w:r>
-        <w:rPr>
-          <w:sz w:val="20"/>
-        </w:rPr>
-        <w:t>Technicien N+1 (Service Technique) : Consulté (C) — si TTR &gt; 60 min ou incident MAJEUR</w:t>
-      </w:r>
-    </w:p>
-    <w:p>
-      <w:pPr>
-        <w:pStyle w:val="ListBullet"/>
-      </w:pPr>
-      <w:r>
-        <w:rPr>
-          <w:sz w:val="20"/>
-        </w:rPr>
-        <w:t>Lugos NOC (astreinte 24h/7j) : Responsable (R) délégué — réinitialisation Radius, intervention switch OOB TH2/TH3</w:t>
-      </w:r>
-    </w:p>
-    <w:p>
-      <w:pPr>
-        <w:pStyle w:val="ListBullet"/>
-      </w:pPr>
-      <w:r>
-        <w:rPr>
-          <w:sz w:val="20"/>
-        </w:rPr>
-        <w:t>Telehouse NOC : Informé (I) — OTN.Management@fr.telehouse.net si impact site</w:t>
-      </w:r>
-    </w:p>
-    <w:p>
-      <w:pPr>
-        <w:pStyle w:val="ListBullet"/>
-      </w:pPr>
-      <w:r>
-        <w:rPr>
-          <w:sz w:val="20"/>
-        </w:rPr>
-        <w:t>Service ISO : Approbateur (A) — revue documentaire post-incident si RCA requise</w:t>
+        <w:t>Criticitées : MINEUR, MINEUR→MAJEUR</w:t>
       </w:r>
     </w:p>
     <w:p>
@@ -1162,59 +1103,7 @@
         <w:rPr>
           <w:sz w:val="20"/>
         </w:rPr>
-        <w:t>Règles d'escalade :</w:t>
-      </w:r>
-    </w:p>
-    <w:p>
-      <w:pPr>
-        <w:pStyle w:val="ListBullet"/>
-      </w:pPr>
-      <w:r>
-        <w:rPr>
-          <w:sz w:val="20"/>
-        </w:rPr>
-        <w:t>TTR &gt; 60 min sans résolution : escalader vers Technicien N+1</w:t>
-      </w:r>
-    </w:p>
-    <w:p>
-      <w:pPr>
-        <w:pStyle w:val="ListBullet"/>
-      </w:pPr>
-      <w:r>
-        <w:rPr>
-          <w:sz w:val="20"/>
-        </w:rPr>
-        <w:t>Impact service client confirmé : basculer sur MOP M0.22 ou M0.24 selon équipement</w:t>
-      </w:r>
-    </w:p>
-    <w:p>
-      <w:pPr>
-        <w:pStyle w:val="ListBullet"/>
-      </w:pPr>
-      <w:r>
-        <w:rPr>
-          <w:sz w:val="20"/>
-        </w:rPr>
-        <w:t>Bascule Fortigate avec service dégradé : contacter astreinte Lugos immédiatement</w:t>
-      </w:r>
-    </w:p>
-    <w:p>
-      <w:pPr>
-        <w:pStyle w:val="ListBullet"/>
-      </w:pPr>
-      <w:r>
-        <w:rPr>
-          <w:sz w:val="20"/>
-        </w:rPr>
-        <w:t>Incident Radius : contacter astreinte Lugos — ne pas tenter &gt; 3 connexions</w:t>
-      </w:r>
-    </w:p>
-    <w:p>
-      <w:r>
-        <w:rPr>
-          <w:sz w:val="20"/>
-        </w:rPr>
-        <w:t>Hors périmètre : interventions physiques sur site TH2/TH3 requièrent coordination Telehouse NOC et bon d'intervention préalable.</w:t>
+        <w:t>Escalade N+1 si TTR &gt; 60 min ou impact service client.</w:t>
       </w:r>
     </w:p>
     <w:p/>
@@ -1242,7 +1131,7 @@
         <w:rPr>
           <w:sz w:val="20"/>
         </w:rPr>
-        <w:t>Contexte terrain (REX 2021-2025, 14 incidents) : causes principales — perte lien OOB opérateur (~60%), bascule cluster Fortigate (~25%), alarmes OSPF auto-cleared &lt;30s sur PHO/Ribbon (~15%). TTR moyen : 15–45 min (alarmes OSPF typiquement cleared &lt; 30 s — vérifier systématiquement la corrélation protection switch PHO).</w:t>
+        <w:t>Retour d'expérience: Les alarmede supervision sont majoritairement liés aux pertes de lien OOB (Cogent, switch), aux bascules du Firewall Fortigate et alarmes OSPF auto-cleared sur PHO/ Ribbon. Le TTR moyen : 15–45 min ; (alarmes OSPF typiquement cleared &lt; 30s) (protection switch PHO corrélé).</w:t>
       </w:r>
     </w:p>
     <w:p>
@@ -1269,7 +1158,7 @@
         <w:rPr>
           <w:sz w:val="20"/>
         </w:rPr>
-        <w:t>Acquitter les alarmes actives Lightsoft/Vizee (envoi mail de prise en charge).</w:t>
+        <w:t>Acquitter alarmes Lightsoft/Vizee (mail).</w:t>
       </w:r>
     </w:p>
     <w:p>
@@ -1280,7 +1169,7 @@
         <w:rPr>
           <w:sz w:val="20"/>
         </w:rPr>
-        <w:t>Vérifier le planning de maintenance TH2/TH3 : si alarme correspond à une maintenance planifiée, documenter et surveiller sans escalader.</w:t>
+        <w:t>Vérifier le planning de maintenance</w:t>
       </w:r>
     </w:p>
     <w:p>
@@ -1291,40 +1180,7 @@
         <w:rPr>
           <w:sz w:val="20"/>
         </w:rPr>
-        <w:t>Ouvrir Vizee (dash-4uvocd.vizee.io) : comparer l'état des NE sur TH2 et TH3. Identifier si la perte est mono-site ou bi-sites, partielle ou totale.</w:t>
-      </w:r>
-    </w:p>
-    <w:p>
-      <w:pPr>
-        <w:pStyle w:val="ListNumber"/>
-      </w:pPr>
-      <w:r>
-        <w:rPr>
-          <w:sz w:val="20"/>
-        </w:rPr>
-        <w:t>Ouvrir Lightsoft : contrôler l'état EMS de chaque NE. Distinguer 'Management Lost' (perte GCC/STMS) de 'Alarm Active' (équipement accessible mais en alarme).</w:t>
-      </w:r>
-    </w:p>
-    <w:p>
-      <w:pPr>
-        <w:pStyle w:val="ListNumber"/>
-      </w:pPr>
-      <w:r>
-        <w:rPr>
-          <w:sz w:val="20"/>
-        </w:rPr>
-        <w:t>Identifier le périmètre exact : NE affectés, sites, type de supervision perdue (Lightsoft seul, Vizee seul, ou les deux).</w:t>
-      </w:r>
-    </w:p>
-    <w:p>
-      <w:pPr>
-        <w:pStyle w:val="ListNumber"/>
-      </w:pPr>
-      <w:r>
-        <w:rPr>
-          <w:sz w:val="20"/>
-        </w:rPr>
-        <w:t>Ouvrir un ticket d'incident : heure de début, périmètre, alarmes observées, criticité initiale.</w:t>
+        <w:t>Consulter Vizee (dash-4uvocd.vizee.io), comparer état NE sur les deux sites.</w:t>
       </w:r>
     </w:p>
     <w:p>
@@ -1343,7 +1199,7 @@
         <w:rPr>
           <w:sz w:val="20"/>
         </w:rPr>
-        <w:t>Appliquer SOP 10-SOP (Vérification OOB &amp; Accès management) : ping gateway OOB, test SSH NE affectés, vérification règles firewall Lugos.</w:t>
+        <w:t>Appliquer Vérification OOB &amp; Accès management 10-SOP (diagnostic initial) → 15-SOP Escalade Ribbon si perte STMS.</w:t>
       </w:r>
     </w:p>
     <w:p>
@@ -1354,7 +1210,7 @@
         <w:rPr>
           <w:sz w:val="20"/>
         </w:rPr>
-        <w:t>Accès SSH KO sur tous les NE d'un site : vérifier connectivité WAN Fortigate (THx-FW-0x). Contrôler les logs Vizee pour détecter une bascule active/passive. Si bascule confirmée → Phase 3 action A.</w:t>
+        <w:t>Si Radius bloqué (A1) : contacter Lugos astreinte — réinitialisation compte.</w:t>
       </w:r>
     </w:p>
     <w:p>
@@ -1365,7 +1221,7 @@
         <w:rPr>
           <w:sz w:val="20"/>
         </w:rPr>
-        <w:t>Accès SSH KO sur un seul NE : vérifier le port switch OOB correspondant (THx-SW-01 ou THx-SW-02). Tester le port console Opengear CM7000 en secours.</w:t>
+        <w:t>Vérifier switch OOB actif (THx-SW-01/02).</w:t>
       </w:r>
     </w:p>
     <w:p>
@@ -1376,40 +1232,7 @@
         <w:rPr>
           <w:sz w:val="20"/>
         </w:rPr>
-        <w:t>Blocage authentification Lightsoft/Vizee (RADIUS timeout) : contacter astreinte Lugos pour réinitialisation. Ne pas tenter &gt; 3 connexions.</w:t>
-      </w:r>
-    </w:p>
-    <w:p>
-      <w:pPr>
-        <w:pStyle w:val="ListNumber"/>
-      </w:pPr>
-      <w:r>
-        <w:rPr>
-          <w:sz w:val="20"/>
-        </w:rPr>
-        <w:t>Alarme OSPF 'No hello received' : vérifier corrélation protection switch PHO sur même NE. Si protection switch actif → alarme vraisemblablement auto-cleared &lt; 30 s. Surveiller 60 s.</w:t>
-      </w:r>
-    </w:p>
-    <w:p>
-      <w:pPr>
-        <w:pStyle w:val="ListNumber"/>
-      </w:pPr>
-      <w:r>
-        <w:rPr>
-          <w:sz w:val="20"/>
-        </w:rPr>
-        <w:t>Perte STMS (NE 'Management Lost' Lightsoft) : appliquer 15-SOP (Escalade Ribbon) — canal GCC affecté, intervention constructeur potentiellement requise.</w:t>
-      </w:r>
-    </w:p>
-    <w:p>
-      <w:pPr>
-        <w:pStyle w:val="ListNumber"/>
-      </w:pPr>
-      <w:r>
-        <w:rPr>
-          <w:sz w:val="20"/>
-        </w:rPr>
-        <w:t>Documenter chaque action dans le ticket : heure, action, résultat observé.</w:t>
+        <w:t>Vérifier firewall cluster THx-FW-01 / TH3-FW-01 (bascule ?)</w:t>
       </w:r>
     </w:p>
     <w:p>
@@ -1428,39 +1251,7 @@
         <w:rPr>
           <w:sz w:val="20"/>
         </w:rPr>
-        <w:t>Appliquer la SOP identifiée en Phase 2 :</w:t>
-      </w:r>
-    </w:p>
-    <w:p>
-      <w:r>
-        <w:rPr>
-          <w:sz w:val="20"/>
-        </w:rPr>
-        <w:t>A. Bascule Fortigate : coordonner avec Lugos NOC pour retour en configuration active/passive standard. Vérifier l'intégrité des routes OOB après retour.</w:t>
-      </w:r>
-    </w:p>
-    <w:p>
-      <w:r>
-        <w:rPr>
-          <w:sz w:val="20"/>
-        </w:rPr>
-        <w:t>B. Perte lien WAN OOB (Cogent/euNetworks) : ouvrir ticket opérateur. Appliquer SOP 17-SOP (Escalade Opérateur).</w:t>
-      </w:r>
-    </w:p>
-    <w:p>
-      <w:r>
-        <w:rPr>
-          <w:sz w:val="20"/>
-        </w:rPr>
-        <w:t>C. Switch OOB défaillant : basculer sur switch redondant (THx-SW-02). Notifier Lugos pour remplacement.</w:t>
-      </w:r>
-    </w:p>
-    <w:p>
-      <w:r>
-        <w:rPr>
-          <w:sz w:val="20"/>
-        </w:rPr>
-        <w:t>D. Radius bloqué : après réinitialisation Lugos, tester login Lightsoft et Vizee. Valider les deux systèmes opérationnels.</w:t>
+        <w:t>Appliquer la SOP identifiée en Etape 2.</w:t>
       </w:r>
     </w:p>
     <w:p>
@@ -1471,18 +1262,7 @@
         <w:rPr>
           <w:sz w:val="20"/>
         </w:rPr>
-        <w:t>Après chaque action corrective : attendre 2 min et vérifier le retour à la normale dans Lightsoft ('In-Service' ou 'Active') et Vizee ('OK' ou 'Operational').</w:t>
-      </w:r>
-    </w:p>
-    <w:p>
-      <w:pPr>
-        <w:pStyle w:val="ListNumber"/>
-      </w:pPr>
-      <w:r>
-        <w:rPr>
-          <w:sz w:val="20"/>
-        </w:rPr>
-        <w:t>Documenter toutes les actions correctives avec heure et résultat constaté.</w:t>
+        <w:t>Documenter les actions</w:t>
       </w:r>
     </w:p>
     <w:p>
@@ -1501,7 +1281,7 @@
         <w:rPr>
           <w:sz w:val="20"/>
         </w:rPr>
-        <w:t>Confirmer le retour à la normale : tous les NE affectés visibles dans Lightsoft ('In-Service') ET dans Vizee ('Operational'). Absence d'alarme active résiduelle.</w:t>
+        <w:t>Confirmer retour à la normale sur Lightsoft et Vizee.</w:t>
       </w:r>
     </w:p>
     <w:p>
@@ -1512,51 +1292,7 @@
         <w:rPr>
           <w:sz w:val="20"/>
         </w:rPr>
-        <w:t>Clôturer le ticket avec :</w:t>
-      </w:r>
-    </w:p>
-    <w:p>
-      <w:pPr>
-        <w:pStyle w:val="ListBullet"/>
-      </w:pPr>
-      <w:r>
-        <w:rPr>
-          <w:sz w:val="20"/>
-        </w:rPr>
-        <w:t>TTR réel (heure début → heure résolution)</w:t>
-      </w:r>
-    </w:p>
-    <w:p>
-      <w:pPr>
-        <w:pStyle w:val="ListBullet"/>
-      </w:pPr>
-      <w:r>
-        <w:rPr>
-          <w:sz w:val="20"/>
-        </w:rPr>
-        <w:t>Cause racine identifiée (lien OOB, Fortigate, Radius, autre)</w:t>
-      </w:r>
-    </w:p>
-    <w:p>
-      <w:pPr>
-        <w:pStyle w:val="ListBullet"/>
-      </w:pPr>
-      <w:r>
-        <w:rPr>
-          <w:sz w:val="20"/>
-        </w:rPr>
-        <w:t>Actions correctives appliquées</w:t>
-      </w:r>
-    </w:p>
-    <w:p>
-      <w:pPr>
-        <w:pStyle w:val="ListBullet"/>
-      </w:pPr>
-      <w:r>
-        <w:rPr>
-          <w:sz w:val="20"/>
-        </w:rPr>
-        <w:t>Références tickets escalade (Lugos, Telehouse, opérateur)</w:t>
+        <w:t>Clôturer le ticket (TTR réel, cause racine, actions correctives).</w:t>
       </w:r>
     </w:p>
     <w:p>
@@ -1567,18 +1303,7 @@
         <w:rPr>
           <w:sz w:val="20"/>
         </w:rPr>
-        <w:t>Incident récurrent (2ème occurrence dans les 30 jours) : escalader vers Service Technique pour analyse RCA. Ouvrir une FAC dans le système qualité.</w:t>
-      </w:r>
-    </w:p>
-    <w:p>
-      <w:pPr>
-        <w:pStyle w:val="ListNumber"/>
-      </w:pPr>
-      <w:r>
-        <w:rPr>
-          <w:sz w:val="20"/>
-        </w:rPr>
-        <w:t>Archiver les exports Vizee et logs Lightsoft dans Lugos-Telehouse-Formation_CdS.</w:t>
+        <w:t>Si incident récurrent : escalader pour analyse RCA.</w:t>
       </w:r>
     </w:p>
     <w:p/>
@@ -1598,7 +1323,7 @@
         <w:rPr>
           <w:sz w:val="20"/>
         </w:rPr>
-        <w:t>OOB : Out Of Band — réseau de gestion externe, indépendant du réseau de transport.</w:t>
+        <w:t>OOB : Out Of Band, Réseau externe des NE disponible même si réseau interne indisponible.</w:t>
       </w:r>
     </w:p>
     <w:p>
@@ -1606,7 +1331,7 @@
         <w:rPr>
           <w:sz w:val="20"/>
         </w:rPr>
-        <w:t>NE : Network Element — équipement optique OTN Ribbon/Apollo.</w:t>
+        <w:t>NE : Network Element,  équipement optique Ribbon.</w:t>
       </w:r>
     </w:p>
     <w:p>
@@ -1614,7 +1339,7 @@
         <w:rPr>
           <w:sz w:val="20"/>
         </w:rPr>
-        <w:t>EMS / Lightsoft : Element Management System Ribbon — supervision via GCC/STMS.</w:t>
+        <w:t>LightSoft/EMS : Logiciel de management des equipement Ribbon</w:t>
       </w:r>
     </w:p>
     <w:p>
@@ -1622,7 +1347,7 @@
         <w:rPr>
           <w:sz w:val="20"/>
         </w:rPr>
-        <w:t>Vizee : supervision SaaS et centralisation des logs OOB (dash-4uvocd.vizee.io).</w:t>
+        <w:t>Vizee : solution SaaS supervision et centralisation des logs OOB.</w:t>
       </w:r>
     </w:p>
     <w:p>
@@ -1630,7 +1355,7 @@
         <w:rPr>
           <w:sz w:val="20"/>
         </w:rPr>
-        <w:t>OSPF : Open Shortest Path First — protocole de routage réseau de gestion Ribbon.</w:t>
+        <w:t>OSPF : protocole de routage interne réseau de gestion Ribbon (NN).</w:t>
       </w:r>
     </w:p>
     <w:p>
@@ -1638,7 +1363,7 @@
         <w:rPr>
           <w:sz w:val="20"/>
         </w:rPr>
-        <w:t>GCC : Gateway Control Channel — canal de gestion interne OTN entre NE.</w:t>
+        <w:t>GCC : Gateway Control Channel — canal de gestion interne OTN.</w:t>
       </w:r>
     </w:p>
     <w:p>
@@ -1646,7 +1371,7 @@
         <w:rPr>
           <w:sz w:val="20"/>
         </w:rPr>
-        <w:t>STMS : Synchronous Transport Management System — gestion synchronisation Ribbon.</w:t>
+        <w:t>Radius : protocole d'authentification réseau (accès LightSoft/Vizee).</w:t>
       </w:r>
     </w:p>
     <w:p>
@@ -1654,7 +1379,7 @@
         <w:rPr>
           <w:sz w:val="20"/>
         </w:rPr>
-        <w:t>Radius : protocole d'authentification réseau (accès Lightsoft/Vizee).</w:t>
+        <w:t>STMS : Synchronous Transport Management System.</w:t>
       </w:r>
     </w:p>
     <w:p>
@@ -1662,36 +1387,12 @@
         <w:rPr>
           <w:sz w:val="20"/>
         </w:rPr>
-        <w:t>TTR : Time To Repair — durée effective de résolution de l'incident.</w:t>
-      </w:r>
-    </w:p>
-    <w:p>
-      <w:r>
-        <w:rPr>
-          <w:sz w:val="20"/>
-        </w:rPr>
-        <w:t>RCA : Root Cause Analysis — analyse de cause racine post-incident.</w:t>
-      </w:r>
-    </w:p>
-    <w:p>
-      <w:r>
-        <w:rPr>
-          <w:sz w:val="20"/>
-        </w:rPr>
-        <w:t>FAC : Fiche d'Action Corrective — document qualité tracé dans le système ISO.</w:t>
-      </w:r>
-    </w:p>
-    <w:p>
-      <w:r>
-        <w:rPr>
-          <w:sz w:val="20"/>
-        </w:rPr>
-        <w:t>SFP : Small Form-factor Pluggable — transceiver optique enfichable.</w:t>
+        <w:t>SFP : Small Form-factor Pluggable — transceiver optique.</w:t>
       </w:r>
     </w:p>
     <w:sectPr>
-      <w:headerReference w:type="default" r:id="rId9"/>
-      <w:footerReference w:type="default" r:id="rId10"/>
+      <w:headerReference w:type="default" r:id="rId10"/>
+      <w:footerReference w:type="default" r:id="rId11"/>
       <w:pgSz w:w="11906" w:h="16838"/>
       <w:pgMar w:top="1134" w:right="1134" w:bottom="1134" w:left="1417" w:header="720" w:footer="720" w:gutter="0"/>
       <w:cols w:space="720"/>

</xml_diff>